<commit_message>
Make reference letter signature-ready
Co-authored-by: ScheelJW <ScheelJW@users.noreply.github.com>
</commit_message>
<xml_diff>
--- a/Attachment S - Character Reference Letter Lt Melody Etsegbe.docx
+++ b/Attachment S - Character Reference Letter Lt Melody Etsegbe.docx
@@ -194,7 +194,7 @@
           <w:rFonts w:ascii="Times New Roman" w:hAnsi="Times New Roman" w:eastAsia="Times New Roman"/>
           <w:sz w:val="24"/>
         </w:rPr>
-        <w:t>[Duty Title / Organization]</w:t>
+        <w:t>Duty Title / Organization: ______________________________</w:t>
       </w:r>
     </w:p>
     <w:p>
@@ -206,7 +206,7 @@
           <w:rFonts w:ascii="Times New Roman" w:hAnsi="Times New Roman" w:eastAsia="Times New Roman"/>
           <w:sz w:val="24"/>
         </w:rPr>
-        <w:t>[Contact Information]</w:t>
+        <w:t>Contact Information: ____________________________________</w:t>
       </w:r>
     </w:p>
     <w:sectPr>

</xml_diff>